<commit_message>
Document external personnel and refresh phase-one evidence
- Requirements: EXT-01 spec, UC-C05 and BR-11 marked implemented,
  updated use case diagram and domain model, traceability row
- API design: external personnel endpoints; OpenAPI regenerated (71 ops)
- UI prototype: external staff page and screenshot
- Acceptance collection gains EXT-01; full run 49 requests, 65 assertions
- Word documents regenerated from mvn clean verify: 38 tests passed,
  line 82.29%, branch 53.47%

Co-Authored-By: Claude Opus 5.5 <noreply@anthropic.com>
</commit_message>
<xml_diff>
--- a/docs/phase-one/01-需求分析文档.docx
+++ b/docs/phase-one/01-需求分析文档.docx
@@ -1008,7 +1008,7 @@
     </w:p>
     <w:p>
       <w:r>
-        <w:t>AccountPolicy 的 personType 与 expiresAt 已有字段并在登录时检查，但一期没有设置入口，因此外部人员与临时人员的有效期（UC-C05、BR-11）仍未实现。Permission 的类型（菜单 / 按钮 / API）是原需求 6.2 的要求，一期尚未建模。</w:t>
+        <w:t>AccountPolicy 的 personType 区分正式员工、外部人员与临时人员，expiresAt 为有效期截止时刻（到期日次日 0 点，Asia/Shanghai）；登录和每次请求都检查有效期（UC-C05、BR-11）。Permission 的类型（菜单 / 按钮 / API）是原需求 6.2 的要求，一期尚未建模。</w:t>
       </w:r>
     </w:p>
     <w:p>
@@ -2599,7 +2599,7 @@
     </w:p>
     <w:p>
       <w:r>
-        <w:t>未完成：失败次数按输入原文计数，账号与手机号分开累计；外部人员有效期无法设置。</w:t>
+        <w:t>未完成：失败次数按输入原文计数，账号与手机号分开累计。</w:t>
       </w:r>
     </w:p>
     <w:p>
@@ -2699,6 +2699,39 @@
     <w:p>
       <w:r>
         <w:t>未完成：权限编码未按“应用:模块:操作”规范校验；权限点无类型和失效标记。</w:t>
+      </w:r>
+    </w:p>
+    <w:p>
+      <w:pPr>
+        <w:pStyle w:val="Heading2"/>
+      </w:pPr>
+      <w:r>
+        <w:t>EXT-01 外部与临时人员有效期</w:t>
+      </w:r>
+    </w:p>
+    <w:p>
+      <w:r>
+        <w:t>对应需求：UC-C05；BR-03、BR-11、BR-13。</w:t>
+      </w:r>
+    </w:p>
+    <w:p>
+      <w:r>
+        <w:t>前置与输入：管理员填写账号、姓名、人员类型（外部人员 / 临时人员）、有效期至、所属部门、岗位、所属单位、电话和初始密码。</w:t>
+      </w:r>
+    </w:p>
+    <w:p>
+      <w:r>
+        <w:t>系统行为：外部人员有效期最长 365 天，临时人员最长 90 天，不能早于今天；部门管理员只能在绑定部门内创建和续期；新账号无角色，初始密码须首次登录后修改；到期日结束后登录返回 401，已登录令牌下一次请求返回 401；14 天内到期的账号在列表中标为即将到期；续期后恢复可用并使权限版本号加一。</w:t>
+      </w:r>
+    </w:p>
+    <w:p>
+      <w:r>
+        <w:t>验收条件：超过上限或早于今天返回 400；跨部门创建返回 403；到期后旧令牌 401、登录被拒；续期后可再次登录；对正式员工续期返回 400。</w:t>
+      </w:r>
+    </w:p>
+    <w:p>
+      <w:r>
+        <w:t>未完成：到期提醒只在管理页面标出，不主动发送消息。</w:t>
       </w:r>
     </w:p>
     <w:p>
@@ -4903,6 +4936,135 @@
                 <w:b w:val="0"/>
                 <w:sz w:val="18"/>
               </w:rPr>
+              <w:t>EXT-01</w:t>
+            </w:r>
+          </w:p>
+        </w:tc>
+        <w:tc>
+          <w:tcPr>
+            <w:tcW w:type="dxa" w:w="2409"/>
+            <w:vAlign w:val="center"/>
+            <w:tcBorders>
+              <w:top w:val="single" w:sz="4" w:color="D9D9D9"/>
+              <w:left w:val="single" w:sz="4" w:color="D9D9D9"/>
+              <w:bottom w:val="single" w:sz="4" w:color="D9D9D9"/>
+              <w:right w:val="single" w:sz="4" w:color="D9D9D9"/>
+            </w:tcBorders>
+            <w:shd w:fill="FFFFFF"/>
+            <w:tcMar>
+              <w:top w:w="80" w:type="dxa"/>
+              <w:bottom w:w="80" w:type="dxa"/>
+              <w:left w:w="80" w:type="dxa"/>
+              <w:right w:w="80" w:type="dxa"/>
+            </w:tcMar>
+          </w:tcPr>
+          <w:p>
+            <w:pPr>
+              <w:spacing w:after="40" w:line="252" w:lineRule="auto"/>
+            </w:pPr>
+            <w:r>
+              <w:rPr>
+                <w:b w:val="0"/>
+                <w:sz w:val="18"/>
+              </w:rPr>
+              <w:t>UC-C05；BR-03 11 13</w:t>
+            </w:r>
+          </w:p>
+        </w:tc>
+        <w:tc>
+          <w:tcPr>
+            <w:tcW w:type="dxa" w:w="2409"/>
+            <w:vAlign w:val="center"/>
+            <w:tcBorders>
+              <w:top w:val="single" w:sz="4" w:color="D9D9D9"/>
+              <w:left w:val="single" w:sz="4" w:color="D9D9D9"/>
+              <w:bottom w:val="single" w:sz="4" w:color="D9D9D9"/>
+              <w:right w:val="single" w:sz="4" w:color="D9D9D9"/>
+            </w:tcBorders>
+            <w:shd w:fill="FFFFFF"/>
+            <w:tcMar>
+              <w:top w:w="80" w:type="dxa"/>
+              <w:bottom w:w="80" w:type="dxa"/>
+              <w:left w:w="80" w:type="dxa"/>
+              <w:right w:w="80" w:type="dxa"/>
+            </w:tcMar>
+          </w:tcPr>
+          <w:p>
+            <w:pPr>
+              <w:spacing w:after="40" w:line="252" w:lineRule="auto"/>
+            </w:pPr>
+            <w:r>
+              <w:rPr>
+                <w:b w:val="0"/>
+                <w:sz w:val="18"/>
+              </w:rPr>
+              <w:t>外部与临时人员；/api/platform/external-users；/api/platform/external-users/{id}/expiry</w:t>
+            </w:r>
+          </w:p>
+        </w:tc>
+        <w:tc>
+          <w:tcPr>
+            <w:tcW w:type="dxa" w:w="2409"/>
+            <w:vAlign w:val="center"/>
+            <w:tcBorders>
+              <w:top w:val="single" w:sz="4" w:color="D9D9D9"/>
+              <w:left w:val="single" w:sz="4" w:color="D9D9D9"/>
+              <w:bottom w:val="single" w:sz="4" w:color="D9D9D9"/>
+              <w:right w:val="single" w:sz="4" w:color="D9D9D9"/>
+            </w:tcBorders>
+            <w:shd w:fill="FFFFFF"/>
+            <w:tcMar>
+              <w:top w:w="80" w:type="dxa"/>
+              <w:bottom w:w="80" w:type="dxa"/>
+              <w:left w:w="80" w:type="dxa"/>
+              <w:right w:w="80" w:type="dxa"/>
+            </w:tcMar>
+          </w:tcPr>
+          <w:p>
+            <w:pPr>
+              <w:spacing w:after="40" w:line="252" w:lineRule="auto"/>
+            </w:pPr>
+            <w:r>
+              <w:rPr>
+                <w:b w:val="0"/>
+                <w:sz w:val="18"/>
+              </w:rPr>
+              <w:t>account_policy、employee_profile、sys_user</w:t>
+            </w:r>
+          </w:p>
+        </w:tc>
+      </w:tr>
+      <w:tr>
+        <w:trPr>
+          <w:cantSplit/>
+        </w:trPr>
+        <w:tc>
+          <w:tcPr>
+            <w:tcW w:type="dxa" w:w="2409"/>
+            <w:vAlign w:val="center"/>
+            <w:tcBorders>
+              <w:top w:val="single" w:sz="4" w:color="D9D9D9"/>
+              <w:left w:val="single" w:sz="4" w:color="D9D9D9"/>
+              <w:bottom w:val="single" w:sz="4" w:color="D9D9D9"/>
+              <w:right w:val="single" w:sz="4" w:color="D9D9D9"/>
+            </w:tcBorders>
+            <w:shd w:fill="FFFFFF"/>
+            <w:tcMar>
+              <w:top w:w="80" w:type="dxa"/>
+              <w:bottom w:w="80" w:type="dxa"/>
+              <w:left w:w="80" w:type="dxa"/>
+              <w:right w:w="80" w:type="dxa"/>
+            </w:tcMar>
+          </w:tcPr>
+          <w:p>
+            <w:pPr>
+              <w:spacing w:after="40" w:line="252" w:lineRule="auto"/>
+            </w:pPr>
+            <w:r>
+              <w:rPr>
+                <w:b w:val="0"/>
+                <w:sz w:val="18"/>
+              </w:rPr>
               <w:t>ORG-01</w:t>
             </w:r>
           </w:p>
@@ -5791,7 +5953,7 @@
     </w:p>
     <w:p>
       <w:r>
-        <w:t>统计：原需求 41 个用例中已实现 20 个、部分实现 13 个、未实现 8 个；20 条业务规则中已实现 12 条、部分实现 5 条、未实现 3 条。状态按代码与自动化测试判定，前端未逐页点击验证。</w:t>
+        <w:t>统计：原需求 41 个用例中已实现 21 个、部分实现 13 个、未实现 7 个；20 条业务规则中已实现 13 条、部分实现 5 条、未实现 2 条。状态按代码与自动化测试判定，前端未逐页点击验证。</w:t>
       </w:r>
     </w:p>
     <w:p>
@@ -9137,7 +9299,7 @@
                 <w:b w:val="0"/>
                 <w:sz w:val="18"/>
               </w:rPr>
-              <w:t>未实现</w:t>
+              <w:t>已实现</w:t>
             </w:r>
           </w:p>
         </w:tc>
@@ -9168,7 +9330,7 @@
                 <w:b w:val="0"/>
                 <w:sz w:val="18"/>
               </w:rPr>
-              <w:t>无设置人员类型和有效期的接口</w:t>
+              <w:t>外部人员 ≤ 365 天、临时人员 ≤ 90 天；到期失效；列表提醒与续期</w:t>
             </w:r>
           </w:p>
         </w:tc>
@@ -12780,7 +12942,7 @@
                 <w:b w:val="0"/>
                 <w:sz w:val="18"/>
               </w:rPr>
-              <w:t>未实现</w:t>
+              <w:t>已实现</w:t>
             </w:r>
           </w:p>
         </w:tc>
@@ -12811,7 +12973,7 @@
                 <w:b w:val="0"/>
                 <w:sz w:val="18"/>
               </w:rPr>
-              <w:t>有到期检查，无法设置；无提醒与续期</w:t>
+              <w:t>必填有效期，到期自动失效，14 天内到期提醒并可续期；提醒不主动推送</w:t>
             </w:r>
           </w:p>
         </w:tc>
@@ -13989,11 +14151,6 @@
       </w:pPr>
       <w:r>
         <w:t>12.3 一期待完成清单</w:t>
-      </w:r>
-    </w:p>
-    <w:p>
-      <w:r>
-        <w:t>- 外部与临时人员：创建时必填类型和有效期，到期自动失效，支持提醒和续期（UC-C05、BR-11）。</w:t>
       </w:r>
     </w:p>
     <w:p>
@@ -14056,7 +14213,7 @@
     </w:p>
     <w:p>
       <w:r>
-        <w:t>实际运行 36 项测试，失败 0，错误 0，跳过 0。JaCoCo 行覆盖率 81.59%，分支覆盖率 52.11%。覆盖率来自本次实际运行报告。</w:t>
+        <w:t>实际运行 38 项测试，失败 0，错误 0，跳过 0。JaCoCo 行覆盖率 82.29%，分支覆盖率 53.47%。覆盖率来自本次实际运行报告。</w:t>
       </w:r>
     </w:p>
     <w:sectPr>

</xml_diff>

<commit_message>
Complete phase-one documents: 20-page UI prototype, full ER, API errors
- UI prototype: page flow and role visibility diagram, the 20 required pages
  mapped to screens, screenshots for super admin, department admin and
  regular user views (fictional data)
- Database design: complete ER diagram drawn from the exported schema
  (25 tables, 24 foreign keys) and the MySQL 8.4 verification section
- API design: error format and codes, the HTTP-status deviation from the
  unified envelope, response examples, refresh tokens, directory and
  permission delivery, initial passwords, permission retirement, and the
  OpenAPI (77 operations) versus route (80) reconciliation
- Requirements: statuses after P1 (27/9/5 use cases, 15/3/2 rules)
- Word files regenerated from mvn clean verify: 44 tests passed,
  line 81.83%, branch 54.87%

Co-Authored-By: Claude Opus 5.5 <noreply@anthropic.com>
</commit_message>
<xml_diff>
--- a/docs/phase-one/01-需求分析文档.docx
+++ b/docs/phase-one/01-需求分析文档.docx
@@ -2096,7 +2096,7 @@
                 <w:b w:val="0"/>
                 <w:sz w:val="18"/>
               </w:rPr>
-              <w:t>导入和 HR 入职账号不设密码，由管理员重置后标记首次修改</w:t>
+              <w:t>导入和 HR 入职时不设密码；管理员按部门批量生成随机初始密码（标记首次修改），在页面下载一次性分发清单</w:t>
             </w:r>
           </w:p>
         </w:tc>
@@ -2127,7 +2127,7 @@
                 <w:b w:val="0"/>
                 <w:sz w:val="18"/>
               </w:rPr>
-              <w:t>避免统一默认密码；一期没有安全的初始密码分发渠道</w:t>
+              <w:t>避免统一默认密码，也避免在导入文件或日志中出现明文密码</w:t>
             </w:r>
           </w:p>
         </w:tc>
@@ -2158,7 +2158,7 @@
                 <w:b w:val="0"/>
                 <w:sz w:val="18"/>
               </w:rPr>
-              <w:t>增加批量生成初始密码并导出分发清单</w:t>
+              <w:t>接入企业短信或邮件后可改为自动分发</w:t>
             </w:r>
           </w:p>
         </w:tc>
@@ -2483,7 +2483,7 @@
                 <w:b w:val="0"/>
                 <w:sz w:val="18"/>
               </w:rPr>
-              <w:t>平台 JWT 有效期 7200 秒，但每次请求都查数据库会话和当前授权；OIDC 访问令牌 5 分钟</w:t>
+              <w:t>平台 JWT 15 分钟并可轮换；OIDC 访问令牌 5 分钟，刷新令牌 8 小时</w:t>
             </w:r>
           </w:p>
         </w:tc>
@@ -2514,7 +2514,7 @@
                 <w:b w:val="0"/>
                 <w:sz w:val="18"/>
               </w:rPr>
-              <w:t>平台 API 在线校验，撤权即时生效</w:t>
+              <w:t>平台 API 每次请求在线校验会话与授权，15 分钟兼顾管理界面体验</w:t>
             </w:r>
           </w:p>
         </w:tc>
@@ -2545,7 +2545,7 @@
                 <w:b w:val="0"/>
                 <w:sz w:val="18"/>
               </w:rPr>
-              <w:t>引入刷新令牌后缩短平台 JWT</w:t>
+              <w:t>如需更短可调 PERMISSION_JWT_EXPIRATION_SECONDS</w:t>
             </w:r>
           </w:p>
         </w:tc>
@@ -2599,7 +2599,7 @@
     </w:p>
     <w:p>
       <w:r>
-        <w:t>未完成：失败次数按输入原文计数，账号与手机号分开累计。</w:t>
+        <w:t>已补充：失败次数按解析后的真实账号累计；平台 JWT 15 分钟并可在 30 分钟空闲窗口内轮换。</w:t>
       </w:r>
     </w:p>
     <w:p>
@@ -2632,7 +2632,7 @@
     </w:p>
     <w:p>
       <w:r>
-        <w:t>未完成：鉴权决策不返回判定依据，拒绝时不记录敏感访问日志。</w:t>
+        <w:t>已补充：允许时返回提供该权限的角色，拒绝时写 ACCESS_DENIED 审计；失效权限点不再计入。</w:t>
       </w:r>
     </w:p>
     <w:p>
@@ -2665,7 +2665,7 @@
     </w:p>
     <w:p>
       <w:r>
-        <w:t>未完成：部门管理员看不到本部门员工的会话和审批记录；审计按操作人部门而非目标部门过滤。</w:t>
+        <w:t>已补充：部门管理员可查看本部门员工会话与审批记录；审计同时按操作人部门和被操作员工部门过滤。</w:t>
       </w:r>
     </w:p>
     <w:p>
@@ -2698,7 +2698,7 @@
     </w:p>
     <w:p>
       <w:r>
-        <w:t>未完成：权限编码未按“应用:模块:操作”规范校验；权限点无类型和失效标记。</w:t>
+        <w:t>已补充：权限编码按“应用:模块:操作”校验；权限点有类型与失效标记，导入的操作权限类型为按钮。</w:t>
       </w:r>
     </w:p>
     <w:p>
@@ -2797,7 +2797,7 @@
     </w:p>
     <w:p>
       <w:r>
-        <w:t>未完成：登出不写审计；会话列表只返回本人会话。</w:t>
+        <w:t>已补充：登出写 LOGOUT 审计；管理员可按范围查看会话。</w:t>
       </w:r>
     </w:p>
     <w:p>
@@ -2830,7 +2830,12 @@
     </w:p>
     <w:p>
       <w:r>
-        <w:t>未完成：刷新令牌（UC-A07）；客户端、授权和密钥持久化；在应用管理中配置回调地址（UC-B02）。</w:t>
+        <w:t>已补充：配置客户端密钥后签发并轮换刷新令牌（UC-A07）；userinfo 与 /api/oidc/permissions 下发权限集合（UC-B08）；/api/oidc/directory 下发组织数据（UC-D02）。</w:t>
+      </w:r>
+    </w:p>
+    <w:p>
+      <w:r>
+        <w:t>未完成：客户端、授权和密钥持久化；在应用管理中配置回调地址（UC-B02）。</w:t>
       </w:r>
     </w:p>
     <w:p>
@@ -2863,7 +2868,7 @@
     </w:p>
     <w:p>
       <w:r>
-        <w:t>未完成：给 OA 的“查询申请人现有权限”辅助接口；部门管理员查询本部门审批记录。</w:t>
+        <w:t>未完成：给 OA 的“查询申请人现有权限”辅助接口。</w:t>
       </w:r>
     </w:p>
     <w:p>
@@ -2962,7 +2967,12 @@
     </w:p>
     <w:p>
       <w:r>
-        <w:t>未完成：原需求列出的 20 个页面尚未全部提供；菜单按权限点渲染未单独验证。</w:t>
+        <w:t>已补充：原需求的 20 个页面均已提供并有运行截图，含部门管理员与普通用户视角。</w:t>
+      </w:r>
+    </w:p>
+    <w:p>
+      <w:r>
+        <w:t>未完成：菜单按权限点渲染未单独验证。</w:t>
       </w:r>
     </w:p>
     <w:p>
@@ -5953,7 +5963,7 @@
     </w:p>
     <w:p>
       <w:r>
-        <w:t>统计：原需求 41 个用例中已实现 21 个、部分实现 13 个、未实现 7 个；20 条业务规则中已实现 13 条、部分实现 5 条、未实现 2 条。状态按代码与自动化测试判定，前端未逐页点击验证。</w:t>
+        <w:t>统计：原需求 41 个用例中已实现 27 个、部分实现 9 个、未实现 5 个；20 条业务规则中已实现 15 条、部分实现 3 条、未实现 2 条。状态按代码与自动化测试判定，前端未逐页点击验证。</w:t>
       </w:r>
     </w:p>
     <w:p>
@@ -6621,7 +6631,7 @@
                 <w:b w:val="0"/>
                 <w:sz w:val="18"/>
               </w:rPr>
-              <w:t>登出后旧 JWT 返回 401；登出未写审计</w:t>
+              <w:t>登出后旧 JWT 返回 401，并写 LOGOUT 审计</w:t>
             </w:r>
           </w:p>
         </w:tc>
@@ -6977,7 +6987,7 @@
                 <w:b w:val="0"/>
                 <w:sz w:val="18"/>
               </w:rPr>
-              <w:t>未实现</w:t>
+              <w:t>已实现</w:t>
             </w:r>
           </w:p>
         </w:tc>
@@ -7008,7 +7018,7 @@
                 <w:b w:val="0"/>
                 <w:sz w:val="18"/>
               </w:rPr>
-              <w:t>无 refresh_token</w:t>
+              <w:t>平台 JWT 轮换；机密客户端获得 OIDC 刷新令牌并轮换</w:t>
             </w:r>
           </w:p>
         </w:tc>
@@ -7880,7 +7890,7 @@
                 <w:b w:val="0"/>
                 <w:sz w:val="18"/>
               </w:rPr>
-              <w:t>部分实现</w:t>
+              <w:t>已实现</w:t>
             </w:r>
           </w:p>
         </w:tc>
@@ -7911,7 +7921,7 @@
                 <w:b w:val="0"/>
                 <w:sz w:val="18"/>
               </w:rPr>
-              <w:t>缺类型、失效标记和编码规范校验</w:t>
+              <w:t>类型、失效标记、编码规范校验、清单导入</w:t>
             </w:r>
           </w:p>
         </w:tc>
@@ -8396,7 +8406,7 @@
                 <w:b w:val="0"/>
                 <w:sz w:val="18"/>
               </w:rPr>
-              <w:t>部分实现</w:t>
+              <w:t>已实现</w:t>
             </w:r>
           </w:p>
         </w:tc>
@@ -8427,7 +8437,7 @@
                 <w:b w:val="0"/>
                 <w:sz w:val="18"/>
               </w:rPr>
-              <w:t>不返回判定依据，拒绝不记敏感访问日志</w:t>
+              <w:t>返回判定依据；拒绝写 ACCESS_DENIED 审计</w:t>
             </w:r>
           </w:p>
         </w:tc>
@@ -8525,7 +8535,7 @@
                 <w:b w:val="0"/>
                 <w:sz w:val="18"/>
               </w:rPr>
-              <w:t>部分实现</w:t>
+              <w:t>已实现</w:t>
             </w:r>
           </w:p>
         </w:tc>
@@ -8556,7 +8566,7 @@
                 <w:b w:val="0"/>
                 <w:sz w:val="18"/>
               </w:rPr>
-              <w:t>平台 API 可查；OIDC userinfo 不含权限</w:t>
+              <w:t>/api/oidc/permissions 与 userinfo 携带权限与版本号</w:t>
             </w:r>
           </w:p>
         </w:tc>
@@ -9201,7 +9211,7 @@
                 <w:b w:val="0"/>
                 <w:sz w:val="18"/>
               </w:rPr>
-              <w:t>沿用工号，无初始密码（见第 6 节）</w:t>
+              <w:t>沿用工号（见第 6 节）；初始密码由管理员按部门批量生成</w:t>
             </w:r>
           </w:p>
         </w:tc>
@@ -9944,7 +9954,7 @@
                 <w:b w:val="0"/>
                 <w:sz w:val="18"/>
               </w:rPr>
-              <w:t>未实现</w:t>
+              <w:t>已实现</w:t>
             </w:r>
           </w:p>
         </w:tc>
@@ -9975,7 +9985,7 @@
                 <w:b w:val="0"/>
                 <w:sz w:val="18"/>
               </w:rPr>
-              <w:t>无面向接入应用的接口</w:t>
+              <w:t>/api/oidc/directory/departments、/users，不含联系方式</w:t>
             </w:r>
           </w:p>
         </w:tc>
@@ -10460,7 +10470,7 @@
                 <w:b w:val="0"/>
                 <w:sz w:val="18"/>
               </w:rPr>
-              <w:t>部分实现</w:t>
+              <w:t>已实现</w:t>
             </w:r>
           </w:p>
         </w:tc>
@@ -10491,7 +10501,7 @@
                 <w:b w:val="0"/>
                 <w:sz w:val="18"/>
               </w:rPr>
-              <w:t>本人可查；部门管理员不能查本部门</w:t>
+              <w:t>本人、本部门管理员与超级管理员分别可查</w:t>
             </w:r>
           </w:p>
         </w:tc>
@@ -11136,7 +11146,7 @@
                 <w:b w:val="0"/>
                 <w:sz w:val="18"/>
               </w:rPr>
-              <w:t>仅按类型前缀过滤；部门范围按操作人</w:t>
+              <w:t>部门范围含被操作员工；仅按类型前缀过滤，不能按时间或用户查询</w:t>
             </w:r>
           </w:p>
         </w:tc>
@@ -11910,7 +11920,7 @@
                 <w:b w:val="0"/>
                 <w:sz w:val="18"/>
               </w:rPr>
-              <w:t>部分实现</w:t>
+              <w:t>已实现</w:t>
             </w:r>
           </w:p>
         </w:tc>
@@ -11941,7 +11951,7 @@
                 <w:b w:val="0"/>
                 <w:sz w:val="18"/>
               </w:rPr>
-              <w:t>BCrypt；重置后首次改密；无自动初始密码</w:t>
+              <w:t>BCrypt；随机初始密码批量生成并标记首次改密</w:t>
             </w:r>
           </w:p>
         </w:tc>
@@ -12426,7 +12436,7 @@
                 <w:b w:val="0"/>
                 <w:sz w:val="18"/>
               </w:rPr>
-              <w:t>部分实现</w:t>
+              <w:t>已实现</w:t>
             </w:r>
           </w:p>
         </w:tc>
@@ -12457,7 +12467,7 @@
                 <w:b w:val="0"/>
                 <w:sz w:val="18"/>
               </w:rPr>
-              <w:t>清单导入；编码规范未校验</w:t>
+              <w:t>清单导入；编码格式校验</w:t>
             </w:r>
           </w:p>
         </w:tc>
@@ -14155,32 +14165,12 @@
     </w:p>
     <w:p>
       <w:r>
-        <w:t>- 令牌刷新与 OIDC 客户端持久化，在应用管理中配置回调地址（UC-A07、UC-B02、UC-D01）。</w:t>
-      </w:r>
-    </w:p>
-    <w:p>
-      <w:r>
-        <w:t>- 权限点类型（菜单 / 按钮 / API）、失效标记与编码规范校验（UC-B03、BR-07）。</w:t>
-      </w:r>
-    </w:p>
-    <w:p>
-      <w:r>
-        <w:t>- 部门管理员查看本部门会话、审批记录与审计，审计按目标部门过滤（UC-A11、UC-E02、UC-F04）。</w:t>
-      </w:r>
-    </w:p>
-    <w:p>
-      <w:r>
-        <w:t>- 用户与部门数据下发接口，userinfo 携带权限集合，鉴权返回判定依据并记录拒绝（UC-D02、UC-B07、UC-B08）。</w:t>
+        <w:t>- OIDC 客户端、授权与密钥持久化，在应用管理中配置回调地址（UC-B02、UC-D01）。</w:t>
       </w:r>
     </w:p>
     <w:p>
       <w:r>
         <w:t>- HR 部门 / 岗位同步、同步异常与对账，调岗通知部门管理员（UC-C02、C03、C07、C08）。</w:t>
-      </w:r>
-    </w:p>
-    <w:p>
-      <w:r>
-        <w:t>- 导入员工批量生成初始密码并分发（BR-03）。</w:t>
       </w:r>
     </w:p>
     <w:p>
@@ -14195,12 +14185,12 @@
     </w:p>
     <w:p>
       <w:r>
-        <w:t>- 界面补齐原需求的 20 个页面，菜单按权限点渲染（第 10 节、BR-08）。</w:t>
+        <w:t>- 菜单按权限点渲染（BR-08）。</w:t>
       </w:r>
     </w:p>
     <w:p>
       <w:r>
-        <w:t>- MySQL 8 建表脚本实测、多实例与性能指标验收（原需求第 9、13 节）。</w:t>
+        <w:t>- 多实例部署、备份恢复与性能指标验收（原需求第 9、13 节）；MySQL 8.4 建表与全量验收已通过，见数据库设计文档第 7 节。</w:t>
       </w:r>
     </w:p>
     <w:p>
@@ -14213,7 +14203,7 @@
     </w:p>
     <w:p>
       <w:r>
-        <w:t>实际运行 38 项测试，失败 0，错误 0，跳过 0。JaCoCo 行覆盖率 82.29%，分支覆盖率 53.47%。覆盖率来自本次实际运行报告。</w:t>
+        <w:t>实际运行 44 项测试，失败 0，错误 0，跳过 0。JaCoCo 行覆盖率 81.83%，分支覆盖率 54.87%。覆盖率来自本次实际运行报告。</w:t>
       </w:r>
     </w:p>
     <w:sectPr>

</xml_diff>

<commit_message>
Fix live MySQL and OIDC integration and record cloud acceptance
</commit_message>
<xml_diff>
--- a/docs/phase-one/01-需求分析文档.docx
+++ b/docs/phase-one/01-需求分析文档.docx
@@ -33,7 +33,7 @@
         <w:pStyle w:val="Subtitle"/>
       </w:pPr>
       <w:r>
-        <w:t>依据 DOC 01 V1.0 原始需求  本次未运行项目测试</w:t>
+        <w:t>依据 DOC 01 V1.0 原始需求  本次未运行项目测试套件  接口联调另有记录</w:t>
       </w:r>
     </w:p>
     <w:p>
@@ -51,7 +51,7 @@
     </w:p>
     <w:p>
       <w:r>
-        <w:t>本次状态为代码补充与设计修订，尚未完成运行验收。只执行编译、类型检查、构建和离线元数据导出，不执行单元测试、集成测试、接口场景、数据库迁移或压力测试。旧版 44 项测试及 MySQL 验收记录仅对应旧提交 01b94f06，不能用于证明本次变更正确。</w:t>
+        <w:t>本次在代码补充与设计修订后，继续执行真实 MySQL 建库、隔离旧结构升级和云端 HTTPS 接口联调，实际通过项目见 cloud-verification.json。没有外部 OA/HR 产品，使用遵循接口契约的调用端验证；没有运行项目单元测试、集成测试套件或压力测试。旧版 44 项测试仅对应旧提交 01b94f06，不能用于证明本次变更正确。</w:t>
       </w:r>
     </w:p>
     <w:p>
@@ -167,7 +167,7 @@
     </w:p>
     <w:p>
       <w:r>
-        <w:t>申请与审批在 OA 发起，平台提供签名 APPLICATION 登记、QUERY_PERMISSIONS 辅助查询、QUERY_APPLICATION_STATUS 状态查询和结果回调。申请单号为 OA 稳定业务编号。批准只授予已登记的岗位角色；驳回、取消不授予。重复请求或相同已处理结论不重复授权，不同结论拒绝覆盖。旧平台申请接口保留兼容，但新界面只引导到 OA。</w:t>
+        <w:t>申请与审批在 OA 发起，平台提供签名 APPLICATION 登记、QUERY_PERMISSIONS 辅助查询、QUERY_APPLICATION_STATUS 状态查询和结果回调。申请单号为 OA 稳定业务编号。批准只授予已登记的岗位角色；驳回、取消不授予。重复请求或相同已处理结论不重复授权，不同结论拒绝覆盖。平台直接创建申请的旧 POST 接口已移除；本人申请状态 GET 查询保留，界面引导到 OA。</w:t>
       </w:r>
     </w:p>
     <w:p>
@@ -2346,7 +2346,7 @@
     </w:p>
     <w:p>
       <w:r>
-        <w:t>下表是代码覆盖说明，不是测试通过清单。每项仍需依据原需求第十三章进行实际验收。</w:t>
+        <w:t>下表是代码覆盖说明，不是所有用例均已验收的声明。本轮实际联调项目见 cloud-verification.json，其余用例仍应依据原需求第十三章验收。</w:t>
       </w:r>
     </w:p>
     <w:tbl>
@@ -7014,7 +7014,7 @@
     </w:p>
     <w:p>
       <w:r>
-        <w:t>数据库迁移需在备份及停止写入后执行；本次只生成脚本，没有访问生产库执行迁移，也没有修改服务器公网入口。审计归档是应用级只读与保留机制，不能替代数据库运维权限隔离、备份和独立审计设施。</w:t>
+        <w:t>服务器上没有旧 RBAC 业务库；新建 unified_permission 供应用使用，另在隔离库按旧版本二十五表建立样例后执行升级，核对为三十八表且原凭证、用户角色关系和权限版本保留。原有其他课程数据库已经备份，数据未改动；数据库公网入口按要求保留。审计归档是应用级只读与保留机制，不能替代数据库运维权限隔离、备份和独立审计设施。</w:t>
       </w:r>
     </w:p>
     <w:p>

</xml_diff>